<commit_message>
La Salle: escena con el formato completo de Site Designer (misma malla)
Co-Authored-By: Claude Opus 5.5 <noreply@anthropic.com>
Claude-Session: https://claude.ai/code/session_01J652KVwAx7nCc91Dn42CnM
</commit_message>
<xml_diff>
--- a/references/lasalle_torre5_escena_tesis/corrida_app/GUIA_corrida_en_vivo_La_Salle.docx
+++ b/references/lasalle_torre5_escena_tesis/corrida_app/GUIA_corrida_en_vivo_La_Salle.docx
@@ -212,6 +212,61 @@
           <w:p>
             <w:r>
               <w:t>La escena de Site Designer: 88 bloques (torre, núcleo, 3 pilas de balcones SO, balcones NE y edificio vecino frente a la SE).</w:t>
+            </w:r>
+          </w:p>
+        </w:tc>
+      </w:tr>
+      <w:tr>
+        <w:tc>
+          <w:tcPr>
+            <w:tcW w:type="dxa" w:w="4320"/>
+          </w:tcPr>
+          <w:p>
+            <w:r>
+              <w:rPr>
+                <w:rFonts w:ascii="Consolas" w:hAnsi="Consolas"/>
+                <w:b/>
+                <w:color w:val="1F4E79"/>
+              </w:rPr>
+              <w:t>escena_lasalle_site_designer.json</w:t>
+            </w:r>
+          </w:p>
+        </w:tc>
+        <w:tc>
+          <w:tcPr>
+            <w:tcW w:type="dxa" w:w="4320"/>
+          </w:tcPr>
+          <w:p>
+            <w:r>
+              <w:rPr>
+                <w:b/>
+              </w:rPr>
+              <w:t>La misma escena</w:t>
+            </w:r>
+            <w:r>
+              <w:t xml:space="preserve"> con el formato completo de una exportación de Site Designer (colores, </w:t>
+            </w:r>
+            <w:r>
+              <w:rPr>
+                <w:rFonts w:ascii="Consolas" w:hAnsi="Consolas"/>
+                <w:b/>
+                <w:color w:val="1F4E79"/>
+              </w:rPr>
+              <w:t>isSolid</w:t>
+            </w:r>
+            <w:r>
+              <w:t xml:space="preserve">, </w:t>
+            </w:r>
+            <w:r>
+              <w:rPr>
+                <w:rFonts w:ascii="Consolas" w:hAnsi="Consolas"/>
+                <w:b/>
+                <w:color w:val="1F4E79"/>
+              </w:rPr>
+              <w:t>group</w:t>
+            </w:r>
+            <w:r>
+              <w:t xml:space="preserve"> y las demás secciones). Úsala para abrirla en Site Designer; también la acepta la app (malla idéntica).</w:t>
             </w:r>
           </w:p>
         </w:tc>

</xml_diff>